<commit_message>
chore: polish civic readiness meeting readiness
</commit_message>
<xml_diff>
--- a/dist/GNPS-Civic-Readiness-Executive-Summary.docx
+++ b/dist/GNPS-Civic-Readiness-Executive-Summary.docx
@@ -2,7 +2,7 @@
 <file path=word/document.xml><?xml version="1.0" encoding="utf-8"?>
 <w:document xmlns:w="http://schemas.openxmlformats.org/wordprocessingml/2006/main" xmlns:m="http://schemas.openxmlformats.org/officeDocument/2006/math" xmlns:r="http://schemas.openxmlformats.org/officeDocument/2006/relationships" xmlns:o="urn:schemas-microsoft-com:office:office" xmlns:v="urn:schemas-microsoft-com:vml" xmlns:w10="urn:schemas-microsoft-com:office:word" xmlns:a="http://schemas.openxmlformats.org/drawingml/2006/main" xmlns:pic="http://schemas.openxmlformats.org/drawingml/2006/picture" xmlns:wp="http://schemas.openxmlformats.org/drawingml/2006/wordprocessingDrawing">
   <w:body>
-    <w:bookmarkStart w:id="21" w:name="X02ded809477f8c657b00c4843b10b34cfd91ae0"/>
+    <w:bookmarkStart w:id="26" w:name="X9b6fee185def87cd54a3054d3b2e52cc5143cb2"/>
     <w:p>
       <w:pPr>
         <w:pStyle w:val="Heading1"/>
@@ -58,7 +58,7 @@
         <w:t xml:space="preserve"> </w:t>
       </w:r>
       <w:r>
-        <w:t xml:space="preserve">v0.2.0 — feature-complete, ready for GNPS-hosted deployment</w:t>
+        <w:t xml:space="preserve">v0.2.0 — feature-complete prototype, ready for GNPS technology/curriculum review and district-approved deployment planning</w:t>
       </w:r>
     </w:p>
     <w:p>
@@ -92,7 +92,7 @@
           <w:b/>
           <w:bCs/>
         </w:rPr>
-        <w:t xml:space="preserve">organizes and tracks every student’s progress toward the New York State Seal of Civic Readiness</w:t>
+        <w:t xml:space="preserve">organizes and tracks every student's progress toward the New York State Seal of Civic Readiness</w:t>
       </w:r>
       <w:r>
         <w:t xml:space="preserve"> </w:t>
@@ -126,7 +126,7 @@
         <w:pStyle w:val="Heading2"/>
       </w:pPr>
       <w:r>
-        <w:t xml:space="preserve">What’s been built</w:t>
+        <w:t xml:space="preserve">What's been built</w:t>
       </w:r>
     </w:p>
     <w:p>
@@ -142,7 +142,7 @@
         <w:pStyle w:val="BodyText"/>
       </w:pPr>
       <w:r>
-        <w:t xml:space="preserve">Under the hood: 11 pathways (NYSED-compliant), 10 schema migrations, 62 automated tests, MIT-licensed open-source code on GitHub, Docker-based self-hosted deployment for GNPS infrastructure (zero third-party SaaS, zero recurring cost).</w:t>
+        <w:t xml:space="preserve">Under the hood: 11 pathways (NYSED-compliant), 10 schema migrations, 121 automated tests, MIT-licensed open-source code on GitHub, and a Docker-based self-hosted deployment path for GNPS infrastructure. If GNPS prefers managed services, those providers can be selected through the district's normal approval process.</w:t>
       </w:r>
     </w:p>
     <w:bookmarkEnd w:id="10"/>
@@ -158,8 +158,7 @@
     <w:tbl>
       <w:tblPr>
         <w:tblStyle w:val="Table"/>
-        <w:tblW w:type="pct" w:w="5000"/>
-        <w:tblLayout w:type="fixed"/>
+        <w:tblW w:type="auto" w:w="0"/>
         <w:tblLook w:firstRow="1" w:lastRow="0" w:firstColumn="0" w:lastColumn="0" w:noHBand="0" w:noVBand="0" w:val="0020"/>
       </w:tblPr>
       <w:tblGrid>
@@ -216,7 +215,7 @@
               <w:pStyle w:val="Compact"/>
             </w:pPr>
             <w:r>
-              <w:t xml:space="preserve">A single GNPS-branded URL to submit hours, projects, and reflections. After every submission, an automatic personalized progress report email arrives — current points, what’s still needed, recent activity.</w:t>
+              <w:t xml:space="preserve">A single GNPS-branded URL to submit hours, projects, and reflections. After every submission, an automatic personalized progress report email arrives — current points, what's still needed, recent activity.</w:t>
             </w:r>
           </w:p>
         </w:tc>
@@ -244,7 +243,7 @@
               <w:pStyle w:val="Compact"/>
             </w:pPr>
             <w:r>
-              <w:t xml:space="preserve">The same progress report cc’d to the student’s faculty advisor. Phase 2: family-visible read-only dashboard.</w:t>
+              <w:t xml:space="preserve">The same progress report cc'd to the student's faculty advisor. Phase 2: family-visible read-only dashboard.</w:t>
             </w:r>
           </w:p>
         </w:tc>
@@ -272,13 +271,7 @@
               <w:pStyle w:val="Compact"/>
             </w:pPr>
             <w:r>
-              <w:t xml:space="preserve">Quick-Push UI: pick a pathway (e.g. </w:t>
-            </w:r>
-            <w:r>
-              <w:t xml:space="preserve">“1.5 pts for HS Civic Project”</w:t>
-            </w:r>
-            <w:r>
-              <w:t xml:space="preserve">), paste a class roster, push the points to all students in one action. NYSED cap rules enforced automatically.</w:t>
+              <w:t xml:space="preserve">Quick-Push UI: pick a pathway (e.g. "1.5 pts for HS Civic Project"), paste a class roster, push the points to all students in one action. NYSED cap rules enforced automatically.</w:t>
             </w:r>
           </w:p>
         </w:tc>
@@ -399,7 +392,7 @@
               <w:t xml:space="preserve">docker compose up</w:t>
             </w:r>
             <w:r>
-              <w:t xml:space="preserve">) on a single Linux VM. No third-party SaaS. Migration runner. Backup script. Full ops runbook.</w:t>
+              <w:t xml:space="preserve">) on a single Linux VM. No required SaaS vendor. Migration runner. Backup script. Full ops runbook.</w:t>
             </w:r>
           </w:p>
         </w:tc>
@@ -462,7 +455,7 @@
         <w:t xml:space="preserve"> </w:t>
       </w:r>
       <w:r>
-        <w:t xml:space="preserve">Peer districts already have programs; GNPS doesn’t. Launching gives our students the same NYSED recognition.</w:t>
+        <w:t xml:space="preserve">Peer districts already have programs; GNPS doesn't. Launching gives our students the same NYSED recognition.</w:t>
       </w:r>
     </w:p>
     <w:p>
@@ -522,13 +515,13 @@
           <w:b/>
           <w:bCs/>
         </w:rPr>
-        <w:t xml:space="preserve">District-controlled, district-owned.</w:t>
-      </w:r>
-      <w:r>
-        <w:t xml:space="preserve"> </w:t>
-      </w:r>
-      <w:r>
-        <w:t xml:space="preserve">Self-hosted on GNPS infrastructure. Student data never leaves the district. FERPA-compliant by architecture.</w:t>
+        <w:t xml:space="preserve">District-controlled.</w:t>
+      </w:r>
+      <w:r>
+        <w:t xml:space="preserve"> </w:t>
+      </w:r>
+      <w:r>
+        <w:t xml:space="preserve">The recommended path can be self-hosted on GNPS infrastructure; any managed provider path remains a district approval decision. Real student data should never enter an unapproved demo environment.</w:t>
       </w:r>
     </w:p>
     <w:p>
@@ -554,20 +547,19 @@
       </w:r>
     </w:p>
     <w:bookmarkEnd w:id="12"/>
-    <w:bookmarkStart w:id="15" w:name="whats-needed-to-go-live"/>
+    <w:bookmarkStart w:id="16" w:name="whats-needed-to-go-live"/>
     <w:p>
       <w:pPr>
         <w:pStyle w:val="Heading2"/>
       </w:pPr>
       <w:r>
-        <w:t xml:space="preserve">What’s needed to go live</w:t>
+        <w:t xml:space="preserve">What's needed to go live</w:t>
       </w:r>
     </w:p>
     <w:tbl>
       <w:tblPr>
         <w:tblStyle w:val="Table"/>
-        <w:tblW w:type="pct" w:w="5000"/>
-        <w:tblLayout w:type="fixed"/>
+        <w:tblW w:type="auto" w:w="0"/>
         <w:tblLook w:firstRow="1" w:lastRow="0" w:firstColumn="0" w:lastColumn="0" w:noHBand="0" w:noVBand="0" w:val="0020"/>
       </w:tblPr>
       <w:tblGrid>
@@ -746,7 +738,7 @@
               <w:pStyle w:val="Compact"/>
             </w:pPr>
             <w:r>
-              <w:t xml:space="preserve">FERPA review of self-hosted architecture</w:t>
+              <w:t xml:space="preserve">FERPA review of the selected deployment architecture and provider path</w:t>
             </w:r>
           </w:p>
         </w:tc>
@@ -796,11 +788,40 @@
         </w:r>
       </w:hyperlink>
       <w:r>
-        <w:t xml:space="preserve">. Full design document available as a polished PDF.</w:t>
-      </w:r>
-    </w:p>
-    <w:bookmarkEnd w:id="15"/>
-    <w:bookmarkStart w:id="16" w:name="cost"/>
+        <w:t xml:space="preserve">. Current meeting guidance is in</w:t>
+      </w:r>
+      <w:r>
+        <w:t xml:space="preserve"> </w:t>
+      </w:r>
+      <w:hyperlink r:id="rId15">
+        <w:r>
+          <w:rPr>
+            <w:rStyle w:val="VerbatimChar"/>
+          </w:rPr>
+          <w:t xml:space="preserve">docs/meeting-brief.md</w:t>
+        </w:r>
+      </w:hyperlink>
+      <w:r>
+        <w:t xml:space="preserve"> </w:t>
+      </w:r>
+      <w:r>
+        <w:t xml:space="preserve">and the forwardable packet in</w:t>
+      </w:r>
+      <w:r>
+        <w:t xml:space="preserve"> </w:t>
+      </w:r>
+      <w:r>
+        <w:rPr>
+          <w:rStyle w:val="VerbatimChar"/>
+        </w:rPr>
+        <w:t xml:space="preserve">dist/admin-share/</w:t>
+      </w:r>
+      <w:r>
+        <w:t xml:space="preserve">.</w:t>
+      </w:r>
+    </w:p>
+    <w:bookmarkEnd w:id="16"/>
+    <w:bookmarkStart w:id="17" w:name="cost"/>
     <w:p>
       <w:pPr>
         <w:pStyle w:val="Heading2"/>
@@ -813,22 +834,28 @@
       <w:pPr>
         <w:pStyle w:val="FirstParagraph"/>
       </w:pPr>
+      <w:r>
+        <w:t xml:space="preserve">The self-hosted path can run with</w:t>
+      </w:r>
+      <w:r>
+        <w:t xml:space="preserve"> </w:t>
+      </w:r>
       <w:r>
         <w:rPr>
           <w:b/>
           <w:bCs/>
         </w:rPr>
-        <w:t xml:space="preserve">$0/month</w:t>
-      </w:r>
-      <w:r>
-        <w:t xml:space="preserve"> </w:t>
-      </w:r>
-      <w:r>
-        <w:t xml:space="preserve">in third-party fees. Runs on existing GNPS infrastructure. The only ongoing cost is the IT staff time for deployment + maintenance (estimated &lt;1 hour/week at steady state).</w:t>
-      </w:r>
-    </w:p>
-    <w:bookmarkEnd w:id="16"/>
-    <w:bookmarkStart w:id="17" w:name="timeline"/>
+        <w:t xml:space="preserve">$0/month in required third-party application fees</w:t>
+      </w:r>
+      <w:r>
+        <w:t xml:space="preserve"> </w:t>
+      </w:r>
+      <w:r>
+        <w:t xml:space="preserve">on existing GNPS infrastructure. If GNPS chooses managed providers for hosting, database, email, storage, or backups, cost and contracts should be handled through the normal district approval process. The main ongoing internal cost is IT staff time for maintenance (estimated &lt;1 hour/week at steady state).</w:t>
+      </w:r>
+    </w:p>
+    <w:bookmarkEnd w:id="17"/>
+    <w:bookmarkStart w:id="18" w:name="timeline"/>
     <w:p>
       <w:pPr>
         <w:pStyle w:val="Heading2"/>
@@ -840,8 +867,7 @@
     <w:tbl>
       <w:tblPr>
         <w:tblStyle w:val="Table"/>
-        <w:tblW w:type="pct" w:w="5000"/>
-        <w:tblLayout w:type="fixed"/>
+        <w:tblW w:type="auto" w:w="0"/>
         <w:tblLook w:firstRow="1" w:lastRow="0" w:firstColumn="0" w:lastColumn="0" w:noHBand="0" w:noVBand="0" w:val="0020"/>
       </w:tblPr>
       <w:tblGrid>
@@ -918,7 +944,7 @@
               <w:pStyle w:val="Compact"/>
             </w:pPr>
             <w:r>
-              <w:t xml:space="preserve">✅ done — feature-complete on Vercel/Supabase free tier as a working demo</w:t>
+              <w:t xml:space="preserve">✅ done — feature-complete prototype with public demo for sample-data workflow review</w:t>
             </w:r>
           </w:p>
         </w:tc>
@@ -942,7 +968,7 @@
               <w:pStyle w:val="Compact"/>
             </w:pPr>
             <w:r>
-              <w:t xml:space="preserve">✅ done — zero SaaS dependencies, Docker stack, full IT runbook</w:t>
+              <w:t xml:space="preserve">✅ done — Docker stack, full IT runbook, and no required SaaS vendor dependencies</w:t>
             </w:r>
           </w:p>
         </w:tc>
@@ -1044,8 +1070,8 @@
         </w:tc>
       </w:tr>
     </w:tbl>
-    <w:bookmarkEnd w:id="17"/>
-    <w:bookmarkStart w:id="18" w:name="source-transparency"/>
+    <w:bookmarkEnd w:id="18"/>
+    <w:bookmarkStart w:id="22" w:name="source--transparency"/>
     <w:p>
       <w:pPr>
         <w:pStyle w:val="Heading2"/>
@@ -1072,8 +1098,19 @@
       <w:r>
         <w:t xml:space="preserve"> </w:t>
       </w:r>
-      <w:r>
-        <w:t xml:space="preserve">https://github.com/SirhanMacx/gnps-civic-readiness — public, MIT-licensed</w:t>
+      <w:hyperlink r:id="rId19">
+        <w:r>
+          <w:rPr>
+            <w:rStyle w:val="Hyperlink"/>
+          </w:rPr>
+          <w:t xml:space="preserve">https://github.com/SirhanMacx/gnps-civic-readiness</w:t>
+        </w:r>
+      </w:hyperlink>
+      <w:r>
+        <w:t xml:space="preserve"> </w:t>
+      </w:r>
+      <w:r>
+        <w:t xml:space="preserve">— public, MIT-licensed</w:t>
       </w:r>
     </w:p>
     <w:p>
@@ -1095,8 +1132,19 @@
         <w:t xml:space="preserve"> </w:t>
       </w:r>
       <w:r>
-        <w:t xml:space="preserve">v0.2.0 (2026-05-04) at https://github.com/SirhanMacx/gnps-civic-readiness/releases/tag/v0.2.0</w:t>
-      </w:r>
+        <w:t xml:space="preserve">v0.2.0 (2026-05-04) at</w:t>
+      </w:r>
+      <w:r>
+        <w:t xml:space="preserve"> </w:t>
+      </w:r>
+      <w:hyperlink r:id="rId20">
+        <w:r>
+          <w:rPr>
+            <w:rStyle w:val="Hyperlink"/>
+          </w:rPr>
+          <w:t xml:space="preserve">https://github.com/SirhanMacx/gnps-civic-readiness/releases/tag/v0.2.0</w:t>
+        </w:r>
+      </w:hyperlink>
     </w:p>
     <w:p>
       <w:pPr>
@@ -1111,17 +1159,22 @@
           <w:b/>
           <w:bCs/>
         </w:rPr>
-        <w:t xml:space="preserve">Live demo (legacy free-tier; superseded by self-host):</w:t>
-      </w:r>
-      <w:r>
-        <w:t xml:space="preserve"> </w:t>
-      </w:r>
-      <w:r>
-        <w:t xml:space="preserve">https://gnps-civic-readiness.vercel.app</w:t>
-      </w:r>
-    </w:p>
-    <w:bookmarkEnd w:id="18"/>
-    <w:bookmarkStart w:id="19" w:name="asks-of-leadership"/>
+        <w:t xml:space="preserve">Live demo (prototype only; sample data only):</w:t>
+      </w:r>
+      <w:r>
+        <w:t xml:space="preserve"> </w:t>
+      </w:r>
+      <w:hyperlink r:id="rId21">
+        <w:r>
+          <w:rPr>
+            <w:rStyle w:val="Hyperlink"/>
+          </w:rPr>
+          <w:t xml:space="preserve">https://gnps-civic-readiness.vercel.app</w:t>
+        </w:r>
+      </w:hyperlink>
+    </w:p>
+    <w:bookmarkEnd w:id="22"/>
+    <w:bookmarkStart w:id="23" w:name="asks-of-leadership"/>
     <w:p>
       <w:pPr>
         <w:pStyle w:val="Heading2"/>
@@ -1240,8 +1293,8 @@
         <w:t xml:space="preserve">the open-source publication and (eventually) the transfer of the GitHub repo to a GNPS-owned organization.</w:t>
       </w:r>
     </w:p>
-    <w:bookmarkEnd w:id="19"/>
-    <w:bookmarkStart w:id="20" w:name="contact"/>
+    <w:bookmarkEnd w:id="23"/>
+    <w:bookmarkStart w:id="25" w:name="contact"/>
     <w:p>
       <w:pPr>
         <w:pStyle w:val="Heading2"/>
@@ -1255,11 +1308,22 @@
         <w:pStyle w:val="FirstParagraph"/>
       </w:pPr>
       <w:r>
-        <w:t xml:space="preserve">Jon · Social Studies Department · Great Neck Public Schools · civicseal@greatneck.k12.ny.us</w:t>
-      </w:r>
-    </w:p>
-    <w:bookmarkEnd w:id="20"/>
-    <w:bookmarkEnd w:id="21"/>
+        <w:t xml:space="preserve">Jon · Social Studies Department · Great Neck Public Schools ·</w:t>
+      </w:r>
+      <w:r>
+        <w:t xml:space="preserve"> </w:t>
+      </w:r>
+      <w:hyperlink r:id="rId24">
+        <w:r>
+          <w:rPr>
+            <w:rStyle w:val="Hyperlink"/>
+          </w:rPr>
+          <w:t xml:space="preserve">civicseal@greatneck.k12.ny.us</w:t>
+        </w:r>
+      </w:hyperlink>
+    </w:p>
+    <w:bookmarkEnd w:id="25"/>
+    <w:bookmarkEnd w:id="26"/>
     <w:sectPr>
       <w:footnotePr>
         <w:numRestart w:val="eachSect"/>
@@ -2283,7 +2347,7 @@
       <w:color w:themeColor="accent1" w:themeShade="BF" w:val="365F91"/>
     </w:rPr>
   </w:style>
-  <w:style w:type="paragraph" w:customStyle="1" w:styleId="SourceCode">
+  <w:style w:customStyle="1" w:styleId="SourceCode" w:type="paragraph">
     <w:name w:val="Source Code"/>
     <w:basedOn w:val="Normal"/>
     <w:link w:val="VerbatimChar"/>
@@ -2291,7 +2355,7 @@
       <w:wordWrap w:val="off"/>
     </w:pPr>
   </w:style>
-  <w:style w:type="character" w:customStyle="1" w:styleId="KeywordTok">
+  <w:style w:customStyle="1" w:styleId="KeywordTok" w:type="character">
     <w:name w:val="KeywordTok"/>
     <w:basedOn w:val="VerbatimChar"/>
     <w:rPr>
@@ -2299,77 +2363,77 @@
       <w:color w:val="007020"/>
     </w:rPr>
   </w:style>
-  <w:style w:type="character" w:customStyle="1" w:styleId="DataTypeTok">
+  <w:style w:customStyle="1" w:styleId="DataTypeTok" w:type="character">
     <w:name w:val="DataTypeTok"/>
     <w:basedOn w:val="VerbatimChar"/>
     <w:rPr>
       <w:color w:val="902000"/>
     </w:rPr>
   </w:style>
-  <w:style w:type="character" w:customStyle="1" w:styleId="DecValTok">
+  <w:style w:customStyle="1" w:styleId="DecValTok" w:type="character">
     <w:name w:val="DecValTok"/>
     <w:basedOn w:val="VerbatimChar"/>
     <w:rPr>
       <w:color w:val="40a070"/>
     </w:rPr>
   </w:style>
-  <w:style w:type="character" w:customStyle="1" w:styleId="BaseNTok">
+  <w:style w:customStyle="1" w:styleId="BaseNTok" w:type="character">
     <w:name w:val="BaseNTok"/>
     <w:basedOn w:val="VerbatimChar"/>
     <w:rPr>
       <w:color w:val="40a070"/>
     </w:rPr>
   </w:style>
-  <w:style w:type="character" w:customStyle="1" w:styleId="FloatTok">
+  <w:style w:customStyle="1" w:styleId="FloatTok" w:type="character">
     <w:name w:val="FloatTok"/>
     <w:basedOn w:val="VerbatimChar"/>
     <w:rPr>
       <w:color w:val="40a070"/>
     </w:rPr>
   </w:style>
-  <w:style w:type="character" w:customStyle="1" w:styleId="ConstantTok">
+  <w:style w:customStyle="1" w:styleId="ConstantTok" w:type="character">
     <w:name w:val="ConstantTok"/>
     <w:basedOn w:val="VerbatimChar"/>
     <w:rPr>
       <w:color w:val="880000"/>
     </w:rPr>
   </w:style>
-  <w:style w:type="character" w:customStyle="1" w:styleId="CharTok">
+  <w:style w:customStyle="1" w:styleId="CharTok" w:type="character">
     <w:name w:val="CharTok"/>
     <w:basedOn w:val="VerbatimChar"/>
     <w:rPr>
       <w:color w:val="4070a0"/>
     </w:rPr>
   </w:style>
-  <w:style w:type="character" w:customStyle="1" w:styleId="SpecialCharTok">
+  <w:style w:customStyle="1" w:styleId="SpecialCharTok" w:type="character">
     <w:name w:val="SpecialCharTok"/>
     <w:basedOn w:val="VerbatimChar"/>
     <w:rPr>
       <w:color w:val="4070a0"/>
     </w:rPr>
   </w:style>
-  <w:style w:type="character" w:customStyle="1" w:styleId="StringTok">
+  <w:style w:customStyle="1" w:styleId="StringTok" w:type="character">
     <w:name w:val="StringTok"/>
     <w:basedOn w:val="VerbatimChar"/>
     <w:rPr>
       <w:color w:val="4070a0"/>
     </w:rPr>
   </w:style>
-  <w:style w:type="character" w:customStyle="1" w:styleId="VerbatimStringTok">
+  <w:style w:customStyle="1" w:styleId="VerbatimStringTok" w:type="character">
     <w:name w:val="VerbatimStringTok"/>
     <w:basedOn w:val="VerbatimChar"/>
     <w:rPr>
       <w:color w:val="4070a0"/>
     </w:rPr>
   </w:style>
-  <w:style w:type="character" w:customStyle="1" w:styleId="SpecialStringTok">
+  <w:style w:customStyle="1" w:styleId="SpecialStringTok" w:type="character">
     <w:name w:val="SpecialStringTok"/>
     <w:basedOn w:val="VerbatimChar"/>
     <w:rPr>
       <w:color w:val="bb6688"/>
     </w:rPr>
   </w:style>
-  <w:style w:type="character" w:customStyle="1" w:styleId="ImportTok">
+  <w:style w:customStyle="1" w:styleId="ImportTok" w:type="character">
     <w:name w:val="ImportTok"/>
     <w:basedOn w:val="VerbatimChar"/>
     <w:rPr>
@@ -2377,7 +2441,7 @@
       <w:color w:val="008000"/>
     </w:rPr>
   </w:style>
-  <w:style w:type="character" w:customStyle="1" w:styleId="CommentTok">
+  <w:style w:customStyle="1" w:styleId="CommentTok" w:type="character">
     <w:name w:val="CommentTok"/>
     <w:basedOn w:val="VerbatimChar"/>
     <w:rPr>
@@ -2385,7 +2449,7 @@
       <w:color w:val="60a0b0"/>
     </w:rPr>
   </w:style>
-  <w:style w:type="character" w:customStyle="1" w:styleId="DocumentationTok">
+  <w:style w:customStyle="1" w:styleId="DocumentationTok" w:type="character">
     <w:name w:val="DocumentationTok"/>
     <w:basedOn w:val="VerbatimChar"/>
     <w:rPr>
@@ -2393,7 +2457,7 @@
       <w:color w:val="ba2121"/>
     </w:rPr>
   </w:style>
-  <w:style w:type="character" w:customStyle="1" w:styleId="AnnotationTok">
+  <w:style w:customStyle="1" w:styleId="AnnotationTok" w:type="character">
     <w:name w:val="AnnotationTok"/>
     <w:basedOn w:val="VerbatimChar"/>
     <w:rPr>
@@ -2402,7 +2466,7 @@
       <w:color w:val="60a0b0"/>
     </w:rPr>
   </w:style>
-  <w:style w:type="character" w:customStyle="1" w:styleId="CommentVarTok">
+  <w:style w:customStyle="1" w:styleId="CommentVarTok" w:type="character">
     <w:name w:val="CommentVarTok"/>
     <w:basedOn w:val="VerbatimChar"/>
     <w:rPr>
@@ -2411,28 +2475,28 @@
       <w:color w:val="60a0b0"/>
     </w:rPr>
   </w:style>
-  <w:style w:type="character" w:customStyle="1" w:styleId="OtherTok">
+  <w:style w:customStyle="1" w:styleId="OtherTok" w:type="character">
     <w:name w:val="OtherTok"/>
     <w:basedOn w:val="VerbatimChar"/>
     <w:rPr>
       <w:color w:val="007020"/>
     </w:rPr>
   </w:style>
-  <w:style w:type="character" w:customStyle="1" w:styleId="FunctionTok">
+  <w:style w:customStyle="1" w:styleId="FunctionTok" w:type="character">
     <w:name w:val="FunctionTok"/>
     <w:basedOn w:val="VerbatimChar"/>
     <w:rPr>
       <w:color w:val="06287e"/>
     </w:rPr>
   </w:style>
-  <w:style w:type="character" w:customStyle="1" w:styleId="VariableTok">
+  <w:style w:customStyle="1" w:styleId="VariableTok" w:type="character">
     <w:name w:val="VariableTok"/>
     <w:basedOn w:val="VerbatimChar"/>
     <w:rPr>
       <w:color w:val="19177c"/>
     </w:rPr>
   </w:style>
-  <w:style w:type="character" w:customStyle="1" w:styleId="ControlFlowTok">
+  <w:style w:customStyle="1" w:styleId="ControlFlowTok" w:type="character">
     <w:name w:val="ControlFlowTok"/>
     <w:basedOn w:val="VerbatimChar"/>
     <w:rPr>
@@ -2440,45 +2504,45 @@
       <w:color w:val="007020"/>
     </w:rPr>
   </w:style>
-  <w:style w:type="character" w:customStyle="1" w:styleId="OperatorTok">
+  <w:style w:customStyle="1" w:styleId="OperatorTok" w:type="character">
     <w:name w:val="OperatorTok"/>
     <w:basedOn w:val="VerbatimChar"/>
     <w:rPr>
       <w:color w:val="666666"/>
     </w:rPr>
   </w:style>
-  <w:style w:type="character" w:customStyle="1" w:styleId="BuiltInTok">
+  <w:style w:customStyle="1" w:styleId="BuiltInTok" w:type="character">
     <w:name w:val="BuiltInTok"/>
     <w:basedOn w:val="VerbatimChar"/>
     <w:rPr>
       <w:color w:val="008000"/>
     </w:rPr>
   </w:style>
-  <w:style w:type="character" w:customStyle="1" w:styleId="ExtensionTok">
+  <w:style w:customStyle="1" w:styleId="ExtensionTok" w:type="character">
     <w:name w:val="ExtensionTok"/>
     <w:basedOn w:val="VerbatimChar"/>
     <w:rPr/>
   </w:style>
-  <w:style w:type="character" w:customStyle="1" w:styleId="PreprocessorTok">
+  <w:style w:customStyle="1" w:styleId="PreprocessorTok" w:type="character">
     <w:name w:val="PreprocessorTok"/>
     <w:basedOn w:val="VerbatimChar"/>
     <w:rPr>
       <w:color w:val="bc7a00"/>
     </w:rPr>
   </w:style>
-  <w:style w:type="character" w:customStyle="1" w:styleId="AttributeTok">
+  <w:style w:customStyle="1" w:styleId="AttributeTok" w:type="character">
     <w:name w:val="AttributeTok"/>
     <w:basedOn w:val="VerbatimChar"/>
     <w:rPr>
       <w:color w:val="7d9029"/>
     </w:rPr>
   </w:style>
-  <w:style w:type="character" w:customStyle="1" w:styleId="RegionMarkerTok">
+  <w:style w:customStyle="1" w:styleId="RegionMarkerTok" w:type="character">
     <w:name w:val="RegionMarkerTok"/>
     <w:basedOn w:val="VerbatimChar"/>
     <w:rPr/>
   </w:style>
-  <w:style w:type="character" w:customStyle="1" w:styleId="InformationTok">
+  <w:style w:customStyle="1" w:styleId="InformationTok" w:type="character">
     <w:name w:val="InformationTok"/>
     <w:basedOn w:val="VerbatimChar"/>
     <w:rPr>
@@ -2487,7 +2551,7 @@
       <w:color w:val="60a0b0"/>
     </w:rPr>
   </w:style>
-  <w:style w:type="character" w:customStyle="1" w:styleId="WarningTok">
+  <w:style w:customStyle="1" w:styleId="WarningTok" w:type="character">
     <w:name w:val="WarningTok"/>
     <w:basedOn w:val="VerbatimChar"/>
     <w:rPr>
@@ -2496,7 +2560,7 @@
       <w:color w:val="60a0b0"/>
     </w:rPr>
   </w:style>
-  <w:style w:type="character" w:customStyle="1" w:styleId="AlertTok">
+  <w:style w:customStyle="1" w:styleId="AlertTok" w:type="character">
     <w:name w:val="AlertTok"/>
     <w:basedOn w:val="VerbatimChar"/>
     <w:rPr>
@@ -2504,7 +2568,7 @@
       <w:color w:val="ff0000"/>
     </w:rPr>
   </w:style>
-  <w:style w:type="character" w:customStyle="1" w:styleId="ErrorTok">
+  <w:style w:customStyle="1" w:styleId="ErrorTok" w:type="character">
     <w:name w:val="ErrorTok"/>
     <w:basedOn w:val="VerbatimChar"/>
     <w:rPr>
@@ -2512,7 +2576,7 @@
       <w:color w:val="ff0000"/>
     </w:rPr>
   </w:style>
-  <w:style w:type="character" w:customStyle="1" w:styleId="NormalTok">
+  <w:style w:customStyle="1" w:styleId="NormalTok" w:type="character">
     <w:name w:val="NormalTok"/>
     <w:basedOn w:val="VerbatimChar"/>
     <w:rPr/>

</xml_diff>